<commit_message>
Agrega v4 de la presentación con lámina 'Escala no es madurez' y guion actualizado
Co-Authored-By: Claude Sonnet 5.5 <noreply@anthropic.com>
Claude-Session: https://claude.ai/code/session_01KmtdsB7L5x8Py9hQbU86U2
</commit_message>
<xml_diff>
--- a/Guion_El_punto_ciego_por_diapositiva.docx
+++ b/Guion_El_punto_ciego_por_diapositiva.docx
@@ -324,7 +324,7 @@
                 <w:sz w:val="22"/>
                 <w:szCs w:val="22"/>
               </w:rPr>
-              <w:t xml:space="preserve">4:00-8:45</w:t>
+              <w:t xml:space="preserve">4:00-8:15</w:t>
             </w:r>
           </w:p>
         </w:tc>
@@ -384,7 +384,7 @@
                 <w:sz w:val="22"/>
                 <w:szCs w:val="22"/>
               </w:rPr>
-              <w:t xml:space="preserve">6-10</w:t>
+              <w:t xml:space="preserve">6-11</w:t>
             </w:r>
           </w:p>
         </w:tc>
@@ -413,7 +413,7 @@
                 <w:sz w:val="22"/>
                 <w:szCs w:val="22"/>
               </w:rPr>
-              <w:t xml:space="preserve">8:45-15:15</w:t>
+              <w:t xml:space="preserve">8:15-15:15</w:t>
             </w:r>
           </w:p>
         </w:tc>
@@ -473,7 +473,7 @@
                 <w:sz w:val="22"/>
                 <w:szCs w:val="22"/>
               </w:rPr>
-              <w:t xml:space="preserve">11-14</w:t>
+              <w:t xml:space="preserve">12-15</w:t>
             </w:r>
           </w:p>
         </w:tc>
@@ -562,7 +562,7 @@
                 <w:sz w:val="22"/>
                 <w:szCs w:val="22"/>
               </w:rPr>
-              <w:t xml:space="preserve">15-18</w:t>
+              <w:t xml:space="preserve">16-19</w:t>
             </w:r>
           </w:p>
         </w:tc>
@@ -651,7 +651,7 @@
                 <w:sz w:val="22"/>
                 <w:szCs w:val="22"/>
               </w:rPr>
-              <w:t xml:space="preserve">19-22</w:t>
+              <w:t xml:space="preserve">20-23</w:t>
             </w:r>
           </w:p>
         </w:tc>
@@ -740,7 +740,7 @@
                 <w:sz w:val="22"/>
                 <w:szCs w:val="22"/>
               </w:rPr>
-              <w:t xml:space="preserve">23-27</w:t>
+              <w:t xml:space="preserve">24-28</w:t>
             </w:r>
           </w:p>
         </w:tc>
@@ -787,7 +787,7 @@
           <w:sz w:val="22"/>
           <w:szCs w:val="22"/>
         </w:rPr>
-        <w:t xml:space="preserve">Tres reglas de cadencia: cada número se dice una sola vez; cada bloque abre con una escena y cierra con una frase corta; hay cuatro pausas reales (láminas 2, 10, 12 y 23): contá hasta cuatro en silencio.</w:t>
+        <w:t xml:space="preserve">Tres reglas de cadencia: cada número se dice una sola vez; cada bloque abre con una escena y cierra con una frase corta; hay cuatro pausas reales (láminas 2, 11, 13 y 24): contá hasta cuatro en silencio.</w:t>
       </w:r>
     </w:p>
     <w:p>
@@ -1164,33 +1164,20 @@
           <w:sz w:val="20"/>
           <w:szCs w:val="20"/>
         </w:rPr>
-        <w:t xml:space="preserve">⏱ 0:45 | acumulado 8:45</w:t>
-      </w:r>
-    </w:p>
-    <w:p>
-      <w:pPr>
-        <w:spacing w:after="120" w:line="300"/>
-      </w:pPr>
-      <w:r>
-        <w:rPr>
-          <w:rFonts w:ascii="Calibri" w:cs="Calibri" w:eastAsia="Calibri" w:hAnsi="Calibri"/>
-          <w:sz w:val="26"/>
-          <w:szCs w:val="26"/>
-        </w:rPr>
-        <w:t xml:space="preserve">Se lo aplicamos a 18 empresas de la región: distintas actividades, distintas escalas, y respondieron distintos roles, no solo el dueño.</w:t>
-      </w:r>
-    </w:p>
-    <w:p>
-      <w:pPr>
-        <w:spacing w:after="120" w:line="300"/>
-      </w:pPr>
-      <w:r>
-        <w:rPr>
-          <w:rFonts w:ascii="Calibri" w:cs="Calibri" w:eastAsia="Calibri" w:hAnsi="Calibri"/>
-          <w:sz w:val="26"/>
-          <w:szCs w:val="26"/>
-        </w:rPr>
-        <w:t xml:space="preserve">Confidencialidad absoluta. Los datos son reales y los vamos a mirar de frente.</w:t>
+        <w:t xml:space="preserve">⏱ 0:15 | acumulado 8:15</w:t>
+      </w:r>
+    </w:p>
+    <w:p>
+      <w:pPr>
+        <w:spacing w:after="120" w:line="300"/>
+      </w:pPr>
+      <w:r>
+        <w:rPr>
+          <w:rFonts w:ascii="Calibri" w:cs="Calibri" w:eastAsia="Calibri" w:hAnsi="Calibri"/>
+          <w:sz w:val="26"/>
+          <w:szCs w:val="26"/>
+        </w:rPr>
+        <w:t xml:space="preserve">Se lo aplicamos a 18 empresas, de distintas actividades y escalas, con confidencialidad absoluta. Los datos son reales.</w:t>
       </w:r>
     </w:p>
     <w:p>
@@ -1226,7 +1213,7 @@
           <w:sz w:val="20"/>
           <w:szCs w:val="20"/>
         </w:rPr>
-        <w:t xml:space="preserve">⏱ 1:15 | acumulado 10:00</w:t>
+        <w:t xml:space="preserve">⏱ 1:15 | acumulado 9:30</w:t>
       </w:r>
     </w:p>
     <w:p>
@@ -1301,7 +1288,7 @@
           <w:sz w:val="20"/>
           <w:szCs w:val="20"/>
         </w:rPr>
-        <w:t xml:space="preserve">⏱ 1:45 | acumulado 11:45</w:t>
+        <w:t xml:space="preserve">⏱ 1:45 | acumulado 11:15</w:t>
       </w:r>
     </w:p>
     <w:p>
@@ -1348,6 +1335,22 @@
     </w:p>
     <w:p>
       <w:pPr>
+        <w:spacing w:after="100"/>
+      </w:pPr>
+      <w:r>
+        <w:rPr>
+          <w:rFonts w:ascii="Calibri" w:cs="Calibri" w:eastAsia="Calibri" w:hAnsi="Calibri"/>
+          <w:i/>
+          <w:iCs/>
+          <w:color w:val="B45F06"/>
+          <w:sz w:val="22"/>
+          <w:szCs w:val="22"/>
+        </w:rPr>
+        <w:t xml:space="preserve">[PENDIENTE: confirmar con la planilla cómo se definen los niveles. Los colores de la lámina 6 dan 4, 9 y 5, y esta lámina dice 4, 12 y 2.]</w:t>
+      </w:r>
+    </w:p>
+    <w:p>
+      <w:pPr>
         <w:pStyle w:val="Heading1"/>
         <w:keepNext/>
         <w:spacing w:after="60" w:before="320"/>
@@ -1361,7 +1364,7 @@
           <w:sz w:val="30"/>
           <w:szCs w:val="30"/>
         </w:rPr>
-        <w:t xml:space="preserve">Lámina 8 · El desnivel estructural</w:t>
+        <w:t xml:space="preserve">Lámina 8 · Escala no es madurez</w:t>
       </w:r>
     </w:p>
     <w:p>
@@ -1379,46 +1382,91 @@
           <w:sz w:val="20"/>
           <w:szCs w:val="20"/>
         </w:rPr>
-        <w:t xml:space="preserve">⏱ 1:15 | acumulado 13:00</w:t>
-      </w:r>
-    </w:p>
-    <w:p>
-      <w:pPr>
-        <w:spacing w:after="120" w:line="300"/>
-      </w:pPr>
-      <w:r>
-        <w:rPr>
-          <w:rFonts w:ascii="Calibri" w:cs="Calibri" w:eastAsia="Calibri" w:hAnsi="Calibri"/>
-          <w:sz w:val="26"/>
-          <w:szCs w:val="26"/>
-        </w:rPr>
-        <w:t xml:space="preserve">Este gráfico muestra algo muy claro: casi toda la nube se junta de un lado. Cultura fuerte, estructura débil.</w:t>
-      </w:r>
-    </w:p>
-    <w:p>
-      <w:pPr>
-        <w:spacing w:after="120" w:line="300"/>
-      </w:pPr>
-      <w:r>
-        <w:rPr>
-          <w:rFonts w:ascii="Calibri" w:cs="Calibri" w:eastAsia="Calibri" w:hAnsi="Calibri"/>
-          <w:sz w:val="26"/>
-          <w:szCs w:val="26"/>
-        </w:rPr>
-        <w:t xml:space="preserve">En 12 de las 18, lo más fuerte es el vínculo y la cultura. Y en 12 de las 18, la mayor brecha son los roles, los procesos y la evaluación.</w:t>
-      </w:r>
-    </w:p>
-    <w:p>
-      <w:pPr>
-        <w:spacing w:after="120" w:line="300"/>
-      </w:pPr>
-      <w:r>
-        <w:rPr>
-          <w:rFonts w:ascii="Calibri" w:cs="Calibri" w:eastAsia="Calibri" w:hAnsi="Calibri"/>
-          <w:sz w:val="26"/>
-          <w:szCs w:val="26"/>
-        </w:rPr>
-        <w:t xml:space="preserve">Los roles y la evaluación quedan últimos en la lista del dueño.</w:t>
+        <w:t xml:space="preserve">⏱ 1:30 | acumulado 12:45</w:t>
+      </w:r>
+    </w:p>
+    <w:p>
+      <w:pPr>
+        <w:spacing w:after="100"/>
+      </w:pPr>
+      <w:r>
+        <w:rPr>
+          <w:rFonts w:ascii="Calibri" w:cs="Calibri" w:eastAsia="Calibri" w:hAnsi="Calibri"/>
+          <w:i/>
+          <w:iCs/>
+          <w:color w:val="B45F06"/>
+          <w:sz w:val="22"/>
+          <w:szCs w:val="22"/>
+        </w:rPr>
+        <w:t xml:space="preserve">[Lámina nueva. Dejar los números en pantalla y mirar a la sala.]</w:t>
+      </w:r>
+    </w:p>
+    <w:p>
+      <w:pPr>
+        <w:spacing w:after="120" w:line="300"/>
+      </w:pPr>
+      <w:r>
+        <w:rPr>
+          <w:rFonts w:ascii="Calibri" w:cs="Calibri" w:eastAsia="Calibri" w:hAnsi="Calibri"/>
+          <w:sz w:val="26"/>
+          <w:szCs w:val="26"/>
+        </w:rPr>
+        <w:t xml:space="preserve">Hay algo que no grita en los promedios y conviene mirar de cerca. Las dos empresas mejor puntuadas, 3,7 y 3,8, son agrícolas de 3 y 8 colaboradores: chicas.</w:t>
+      </w:r>
+    </w:p>
+    <w:p>
+      <w:pPr>
+        <w:spacing w:after="120" w:line="300"/>
+      </w:pPr>
+      <w:r>
+        <w:rPr>
+          <w:rFonts w:ascii="Calibri" w:cs="Calibri" w:eastAsia="Calibri" w:hAnsi="Calibri"/>
+          <w:sz w:val="26"/>
+          <w:szCs w:val="26"/>
+        </w:rPr>
+        <w:t xml:space="preserve">En cambio, las cuatro de 75 colaboradores están entre 3,0 y 3,4. Tienen piso, pero ninguna llegó arriba. Y en el otro extremo, cuatro de las cinco ganaderas están por debajo de 3,0, y ninguna pasa de ese número.</w:t>
+      </w:r>
+    </w:p>
+    <w:p>
+      <w:pPr>
+        <w:spacing w:after="120" w:line="300"/>
+      </w:pPr>
+      <w:r>
+        <w:rPr>
+          <w:rFonts w:ascii="Calibri" w:cs="Calibri" w:eastAsia="Calibri" w:hAnsi="Calibri"/>
+          <w:sz w:val="26"/>
+          <w:szCs w:val="26"/>
+        </w:rPr>
+        <w:t xml:space="preserve">Escala no es madurez. El tamaño te da un piso, no te da diseño.</w:t>
+      </w:r>
+    </w:p>
+    <w:p>
+      <w:pPr>
+        <w:spacing w:after="100"/>
+      </w:pPr>
+      <w:r>
+        <w:rPr>
+          <w:rFonts w:ascii="Calibri" w:cs="Calibri" w:eastAsia="Calibri" w:hAnsi="Calibri"/>
+          <w:i/>
+          <w:iCs/>
+          <w:color w:val="B45F06"/>
+          <w:sz w:val="22"/>
+          <w:szCs w:val="22"/>
+        </w:rPr>
+        <w:t xml:space="preserve">[Si preguntan: son grupos de 5 o 6 empresas; sirven para conversar, no para sacar una regla.]</w:t>
+      </w:r>
+    </w:p>
+    <w:p>
+      <w:pPr>
+        <w:spacing w:after="120" w:line="300"/>
+      </w:pPr>
+      <w:r>
+        <w:rPr>
+          <w:rFonts w:ascii="Calibri" w:cs="Calibri" w:eastAsia="Calibri" w:hAnsi="Calibri"/>
+          <w:sz w:val="26"/>
+          <w:szCs w:val="26"/>
+        </w:rPr>
+        <w:t xml:space="preserve">¿Cuántos de nosotros pensamos alguna vez que crecer iba a ordenar la casa solo?</w:t>
       </w:r>
     </w:p>
     <w:p>
@@ -1436,7 +1484,7 @@
           <w:sz w:val="30"/>
           <w:szCs w:val="30"/>
         </w:rPr>
-        <w:t xml:space="preserve">Lámina 9 · Lo que se ve y lo que sostiene</w:t>
+        <w:t xml:space="preserve">Lámina 9 · El desnivel estructural</w:t>
       </w:r>
     </w:p>
     <w:p>
@@ -1454,46 +1502,33 @@
           <w:sz w:val="20"/>
           <w:szCs w:val="20"/>
         </w:rPr>
-        <w:t xml:space="preserve">⏱ 1:30 | acumulado 14:30</w:t>
-      </w:r>
-    </w:p>
-    <w:p>
-      <w:pPr>
-        <w:spacing w:after="120" w:line="300"/>
-      </w:pPr>
-      <w:r>
-        <w:rPr>
-          <w:rFonts w:ascii="Calibri" w:cs="Calibri" w:eastAsia="Calibri" w:hAnsi="Calibri"/>
-          <w:sz w:val="26"/>
-          <w:szCs w:val="26"/>
-        </w:rPr>
-        <w:t xml:space="preserve">Lo ponemos en dos números. 4,3 en mística e intención: buen clima, esfuerzo, identidad. El motor del campo sigue siendo la mística, y eso es una enorme riqueza.</w:t>
-      </w:r>
-    </w:p>
-    <w:p>
-      <w:pPr>
-        <w:spacing w:after="120" w:line="300"/>
-      </w:pPr>
-      <w:r>
-        <w:rPr>
-          <w:rFonts w:ascii="Calibri" w:cs="Calibri" w:eastAsia="Calibri" w:hAnsi="Calibri"/>
-          <w:sz w:val="26"/>
-          <w:szCs w:val="26"/>
-        </w:rPr>
-        <w:t xml:space="preserve">Del otro lado, 2,8 en estructura y procesos: hacemos las cosas bien, pero sin saber si es lo que más conviene y sin dejarlo escrito.</w:t>
-      </w:r>
-    </w:p>
-    <w:p>
-      <w:pPr>
-        <w:spacing w:after="120" w:line="300"/>
-      </w:pPr>
-      <w:r>
-        <w:rPr>
-          <w:rFonts w:ascii="Calibri" w:cs="Calibri" w:eastAsia="Calibri" w:hAnsi="Calibri"/>
-          <w:sz w:val="26"/>
-          <w:szCs w:val="26"/>
-        </w:rPr>
-        <w:t xml:space="preserve">Lo vimos lote por lote. La cultura corre más rápido que la estructura que la sostiene.</w:t>
+        <w:t xml:space="preserve">⏱ 0:45 | acumulado 13:30</w:t>
+      </w:r>
+    </w:p>
+    <w:p>
+      <w:pPr>
+        <w:spacing w:after="120" w:line="300"/>
+      </w:pPr>
+      <w:r>
+        <w:rPr>
+          <w:rFonts w:ascii="Calibri" w:cs="Calibri" w:eastAsia="Calibri" w:hAnsi="Calibri"/>
+          <w:sz w:val="26"/>
+          <w:szCs w:val="26"/>
+        </w:rPr>
+        <w:t xml:space="preserve">Casi toda la nube se junta de un lado: cultura fuerte, estructura débil.</w:t>
+      </w:r>
+    </w:p>
+    <w:p>
+      <w:pPr>
+        <w:spacing w:after="120" w:line="300"/>
+      </w:pPr>
+      <w:r>
+        <w:rPr>
+          <w:rFonts w:ascii="Calibri" w:cs="Calibri" w:eastAsia="Calibri" w:hAnsi="Calibri"/>
+          <w:sz w:val="26"/>
+          <w:szCs w:val="26"/>
+        </w:rPr>
+        <w:t xml:space="preserve">12 de las 18 tienen la cultura como su punto más fuerte, y 12 de las 18, la estructura como su mayor brecha.</w:t>
       </w:r>
     </w:p>
     <w:p>
@@ -1511,7 +1546,69 @@
           <w:sz w:val="30"/>
           <w:szCs w:val="30"/>
         </w:rPr>
-        <w:t xml:space="preserve">Lámina 10 · La mística no escala</w:t>
+        <w:t xml:space="preserve">Lámina 10 · Lo que se ve y lo que sostiene</w:t>
+      </w:r>
+    </w:p>
+    <w:p>
+      <w:pPr>
+        <w:keepNext/>
+        <w:pBdr>
+          <w:bottom w:val="single" w:color="1F3A5F" w:sz="6" w:space="2"/>
+        </w:pBdr>
+        <w:spacing w:after="120"/>
+      </w:pPr>
+      <w:r>
+        <w:rPr>
+          <w:rFonts w:ascii="Calibri" w:cs="Calibri" w:eastAsia="Calibri" w:hAnsi="Calibri"/>
+          <w:color w:val="777777"/>
+          <w:sz w:val="20"/>
+          <w:szCs w:val="20"/>
+        </w:rPr>
+        <w:t xml:space="preserve">⏱ 1:00 | acumulado 14:30</w:t>
+      </w:r>
+    </w:p>
+    <w:p>
+      <w:pPr>
+        <w:spacing w:after="120" w:line="300"/>
+      </w:pPr>
+      <w:r>
+        <w:rPr>
+          <w:rFonts w:ascii="Calibri" w:cs="Calibri" w:eastAsia="Calibri" w:hAnsi="Calibri"/>
+          <w:sz w:val="26"/>
+          <w:szCs w:val="26"/>
+        </w:rPr>
+        <w:t xml:space="preserve">4,3 en mística e intención. 2,8 en estructura y procesos.</w:t>
+      </w:r>
+    </w:p>
+    <w:p>
+      <w:pPr>
+        <w:spacing w:after="120" w:line="300"/>
+      </w:pPr>
+      <w:r>
+        <w:rPr>
+          <w:rFonts w:ascii="Calibri" w:cs="Calibri" w:eastAsia="Calibri" w:hAnsi="Calibri"/>
+          <w:sz w:val="26"/>
+          <w:szCs w:val="26"/>
+        </w:rPr>
+        <w:t xml:space="preserve">Lo vimos lote por lote: la cultura corre más rápido que la estructura que la sostiene.</w:t>
+      </w:r>
+    </w:p>
+    <w:p>
+      <w:pPr>
+        <w:pStyle w:val="Heading1"/>
+        <w:keepNext/>
+        <w:spacing w:after="60" w:before="320"/>
+      </w:pPr>
+      <w:r>
+        <w:rPr>
+          <w:rFonts w:ascii="Calibri" w:cs="Calibri" w:eastAsia="Calibri" w:hAnsi="Calibri"/>
+          <w:b/>
+          <w:bCs/>
+          <w:color w:val="1F3A5F"/>
+          <w:sz w:val="30"/>
+          <w:szCs w:val="30"/>
+        </w:rPr>
+        <w:t xml:space="preserve">Lámina 11 · La mística no escala</w:t>
       </w:r>
     </w:p>
     <w:p>
@@ -1592,7 +1689,7 @@
           <w:sz w:val="30"/>
           <w:szCs w:val="30"/>
         </w:rPr>
-        <w:t xml:space="preserve">Lámina 11 · Segunda parte: tres patrones</w:t>
+        <w:t xml:space="preserve">Lámina 12 · Segunda parte: tres patrones</w:t>
       </w:r>
     </w:p>
     <w:p>
@@ -1641,7 +1738,7 @@
           <w:sz w:val="30"/>
           <w:szCs w:val="30"/>
         </w:rPr>
-        <w:t xml:space="preserve">Lámina 12 · Vulnerabilidad 01: Dueño-dependencia</w:t>
+        <w:t xml:space="preserve">Lámina 13 · Vulnerabilidad 01: Dueño-dependencia</w:t>
       </w:r>
     </w:p>
     <w:p>
@@ -1727,7 +1824,7 @@
           <w:sz w:val="30"/>
           <w:szCs w:val="30"/>
         </w:rPr>
-        <w:t xml:space="preserve">Lámina 13 · Vulnerabilidad 02: Entrenar para el vecino</w:t>
+        <w:t xml:space="preserve">Lámina 14 · Vulnerabilidad 02: Entrenar para el vecino</w:t>
       </w:r>
     </w:p>
     <w:p>
@@ -1802,7 +1899,7 @@
           <w:sz w:val="30"/>
           <w:szCs w:val="30"/>
         </w:rPr>
-        <w:t xml:space="preserve">Lámina 14 · Vulnerabilidad 03: Incentivos a ciegas</w:t>
+        <w:t xml:space="preserve">Lámina 15 · Vulnerabilidad 03: Incentivos a ciegas</w:t>
       </w:r>
     </w:p>
     <w:p>
@@ -1877,7 +1974,7 @@
           <w:sz w:val="30"/>
           <w:szCs w:val="30"/>
         </w:rPr>
-        <w:t xml:space="preserve">Lámina 15 · Tercera parte: pregunta por pregunta</w:t>
+        <w:t xml:space="preserve">Lámina 16 · Tercera parte: pregunta por pregunta</w:t>
       </w:r>
     </w:p>
     <w:p>
@@ -1926,7 +2023,7 @@
           <w:sz w:val="30"/>
           <w:szCs w:val="30"/>
         </w:rPr>
-        <w:t xml:space="preserve">Lámina 16 · Mismo corazón, otra conducción</w:t>
+        <w:t xml:space="preserve">Lámina 17 · Mismo corazón, otra conducción</w:t>
       </w:r>
     </w:p>
     <w:p>
@@ -2014,7 +2111,7 @@
           <w:sz w:val="30"/>
           <w:szCs w:val="30"/>
         </w:rPr>
-        <w:t xml:space="preserve">Lámina 17 · El eslabón que falta: el mando medio</w:t>
+        <w:t xml:space="preserve">Lámina 18 · El eslabón que falta: el mando medio</w:t>
       </w:r>
     </w:p>
     <w:p>
@@ -2128,7 +2225,7 @@
           <w:sz w:val="30"/>
           <w:szCs w:val="30"/>
         </w:rPr>
-        <w:t xml:space="preserve">Lámina 18 · Acá la cultura no es discurso</w:t>
+        <w:t xml:space="preserve">Lámina 19 · Acá la cultura no es discurso</w:t>
       </w:r>
     </w:p>
     <w:p>
@@ -2203,7 +2300,7 @@
           <w:sz w:val="30"/>
           <w:szCs w:val="30"/>
         </w:rPr>
-        <w:t xml:space="preserve">Lámina 19 · Por dónde empezar: cinco palancas</w:t>
+        <w:t xml:space="preserve">Lámina 20 · Por dónde empezar: cinco palancas</w:t>
       </w:r>
     </w:p>
     <w:p>
@@ -2333,7 +2430,7 @@
           <w:sz w:val="30"/>
           <w:szCs w:val="30"/>
         </w:rPr>
-        <w:t xml:space="preserve">Lámina 20 · La solución no es burocracia</w:t>
+        <w:t xml:space="preserve">Lámina 21 · La solución no es burocracia</w:t>
       </w:r>
     </w:p>
     <w:p>
@@ -2424,7 +2521,7 @@
           <w:sz w:val="30"/>
           <w:szCs w:val="30"/>
         </w:rPr>
-        <w:t xml:space="preserve">Lámina 21 · Dos planos: persona y sistema</w:t>
+        <w:t xml:space="preserve">Lámina 22 · Dos planos: persona y sistema</w:t>
       </w:r>
     </w:p>
     <w:p>
@@ -2512,7 +2609,7 @@
           <w:sz w:val="30"/>
           <w:szCs w:val="30"/>
         </w:rPr>
-        <w:t xml:space="preserve">Lámina 22 · La hoja de ruta</w:t>
+        <w:t xml:space="preserve">Lámina 23 · La hoja de ruta</w:t>
       </w:r>
     </w:p>
     <w:p>
@@ -2600,7 +2697,7 @@
           <w:sz w:val="30"/>
           <w:szCs w:val="30"/>
         </w:rPr>
-        <w:t xml:space="preserve">Lámina 23 · Las preguntas que deja el diagnóstico</w:t>
+        <w:t xml:space="preserve">Lámina 24 · Las preguntas que deja el diagnóstico</w:t>
       </w:r>
     </w:p>
     <w:p>
@@ -2753,7 +2850,7 @@
           <w:sz w:val="30"/>
           <w:szCs w:val="30"/>
         </w:rPr>
-        <w:t xml:space="preserve">Lámina 24 · Lo que esto nos dice</w:t>
+        <w:t xml:space="preserve">Lámina 25 · Lo que esto nos dice</w:t>
       </w:r>
     </w:p>
     <w:p>
@@ -2857,7 +2954,7 @@
           <w:sz w:val="30"/>
           <w:szCs w:val="30"/>
         </w:rPr>
-        <w:t xml:space="preserve">Lámina 25 · La frase de cierre</w:t>
+        <w:t xml:space="preserve">Lámina 26 · La frase de cierre</w:t>
       </w:r>
     </w:p>
     <w:p>
@@ -2951,7 +3048,7 @@
           <w:sz w:val="30"/>
           <w:szCs w:val="30"/>
         </w:rPr>
-        <w:t xml:space="preserve">Lámina 26 · Gracias</w:t>
+        <w:t xml:space="preserve">Lámina 27 · Gracias</w:t>
       </w:r>
     </w:p>
     <w:p>
@@ -3000,7 +3097,7 @@
           <w:sz w:val="30"/>
           <w:szCs w:val="30"/>
         </w:rPr>
-        <w:t xml:space="preserve">Lámina 27 · Para seguir trabajándolo (QR)</w:t>
+        <w:t xml:space="preserve">Lámina 28 · Para seguir trabajándolo (QR)</w:t>
       </w:r>
     </w:p>
     <w:p>

</xml_diff>